<commit_message>
fix(docx-remediation): wave 03b bm139 legacy placeholders
Co-authored-by: Cursor <cursoragent@cursor.com>
</commit_message>
<xml_diff>
--- a/storage/templates/normalized-docx/BM-139/BM-139_normalized.docx
+++ b/storage/templates/normalized-docx/BM-139/BM-139_normalized.docx
@@ -1053,7 +1053,7 @@
           <w:rFonts w:cs="Times New Roman" w:ascii="Times New Roman" w:hAnsi="Times New Roman"/>
           <w:szCs w:val="28"/>
         </w:rPr>
-        <w:t>{{document.ngayBan}}</w:t>
+        <w:t>{{document.issueDate}}</w:t>
       </w:r>
       <w:r>
         <w:rPr>
@@ -1122,7 +1122,7 @@
           <w:rFonts w:cs="Times New Roman" w:ascii="Times New Roman" w:hAnsi="Times New Roman"/>
           <w:spacing w:val="-4"/>
         </w:rPr>
-        <w:t xml:space="preserve">{{agency.dongDia}}</w:t>
+        <w:t xml:space="preserve">{{recipients.localityName}}</w:t>
       </w:r>
     </w:p>
     <w:p>
@@ -1329,7 +1329,7 @@
                 <w:bCs/>
                 <w:sz w:val="24"/>
               </w:rPr>
-              <w:t>{{document.chuThe}}</w:t>
+              <w:t>{{person.personFullName}}</w:t>
             </w:r>
           </w:p>
           <w:p>

</xml_diff>